<commit_message>
Ajusta CTAs de síndico e executivo, adiciona credenciais do executivo
Padroniza a CTA de sessão estratégica do roteiro de síndico com a
mesma estrutura do roteiro de fornecedor, e adiciona as credenciais
de M&A (2.200 condomínios, 8.000 imóveis locados, 20 operações de
M&A) na autoridade e CTA do roteiro de executivos.
</commit_message>
<xml_diff>
--- a/eleva/roteiros-videos-tres-publicos/roteiros-videos-giuliano.docx
+++ b/eleva/roteiros-videos-tres-publicos/roteiros-videos-giuliano.docx
@@ -380,7 +380,7 @@
         <w:spacing w:after="100"/>
       </w:pPr>
       <w:r>
-        <w:t xml:space="preserve">Síndico, você pode se aprimorar e se posicionar como esse parceiro de negócios que gera patrimônio através do meu Curso Avançado de Síndico. Comente 'SÍNDICO' que eu te envio todas as informações no direct, ou acessa o link da bio.</w:t>
+        <w:t xml:space="preserve">Síndico, você pode se aprimorar e se posicionar como esse parceiro de negócios que gere patrimônio através do meu Curso Avançado de Síndico. Comente 'SÍNDICO' e eu vou te enviar todas as informações no direct, ou acessa o link da bio.</w:t>
       </w:r>
     </w:p>
     <w:p>
@@ -404,7 +404,7 @@
         <w:spacing w:after="100"/>
       </w:pPr>
       <w:r>
-        <w:t xml:space="preserve">Agora, se você já está pronto pra dar um passo mais acelerado, quer que eu faça um diagnóstico ou uma mentoria personalizada pra você, o primeiro passo é a gente conversar numa sessão estratégica, uma reunião online gratuita comigo. Se você se interessou, comente 'SESSÃO' que minha equipe vai agendar sua sessão estratégica gratuita, ou também acesse todas as informações pelo link da bio.</w:t>
+        <w:t xml:space="preserve">Agora, caso você já queira dar um passo mais acelerado, que é a minha expertise para te ajudar de maneira personalizada no seu negócio, te convido para uma reunião online: nossa sessão estratégica gratuita, para eu entender o seu cenário e te propor um diagnóstico ou uma mentoria para te auxiliar. Caso você deseje, comente 'SESSÃO' que eu te envio todos os detalhes no seu direct, ou se preferir, acessa o link da bio.</w:t>
       </w:r>
     </w:p>
     <w:p>
@@ -850,7 +850,7 @@
         <w:spacing w:after="100"/>
       </w:pPr>
       <w:r>
-        <w:t xml:space="preserve">Muito prazer, meu nome é Giuliano Spolavori, tenho mais de 35 anos de mercado condominial, já administrei mais de 2 mil condomínios, já fiz fusões, aquisições.</w:t>
+        <w:t xml:space="preserve">Muito prazer, meu nome é Giuliano Spolavori, tenho mais de 35 anos de mercado condominial. Mais de 2.200 condomínios administrados, mais de 8.000 imóveis locados e mais de 20 operações de M&amp;A.</w:t>
       </w:r>
     </w:p>
     <w:p>
@@ -874,7 +874,7 @@
         <w:spacing w:after="100"/>
       </w:pPr>
       <w:r>
-        <w:t xml:space="preserve">Através de uma sessão estratégica gratuita, posso entender mais a fundo o seu caso para fazermos um diagnóstico, e até mesmo uma mentoria, para resolver esses pontos e outros, para que você consiga escalar o seu negócio. Se interessou? Comente 'SESSÃO' aqui embaixo que eu te passo todos os detalhes para agendarmos nossa reunião no seu direct, ou se preferir, acessa o link da bio.</w:t>
+        <w:t xml:space="preserve">Caso você queira minha ajuda, minha expertise personalizada para o seu negócio, te convido para uma reunião online: nossa sessão estratégica gratuita, para eu entender o seu cenário e te propor um diagnóstico ou uma mentoria para te auxiliar. Caso você deseje, comente 'SESSÃO', e eu te enviarei todos os detalhes no seu direct, ou se preferir, acessa o link da bio.</w:t>
       </w:r>
     </w:p>
     <w:p>
@@ -915,15 +915,15 @@
         <w:spacing w:after="150"/>
       </w:pPr>
       <w:r>
-        <w:t xml:space="preserve">Sou Giuliano Spolavori, mais de 35 anos de mercado condominial, mais de 2 mil condomínios administrados, já fiz fusões e aquisições.</w:t>
-      </w:r>
-    </w:p>
-    <w:p>
-      <w:pPr>
-        <w:spacing w:after="150"/>
-      </w:pPr>
-      <w:r>
-        <w:t xml:space="preserve">Comente "SESSÃO" que eu te passo os detalhes para agendarmos sua sessão estratégica gratuita, ou acessa direto pelo link da bio.</w:t>
+        <w:t xml:space="preserve">Sou Giuliano Spolavori, mais de 35 anos de mercado condominial. Mais de 2.200 condomínios administrados, mais de 8.000 imóveis locados e mais de 20 operações de M&amp;A.</w:t>
+      </w:r>
+    </w:p>
+    <w:p>
+      <w:pPr>
+        <w:spacing w:after="150"/>
+      </w:pPr>
+      <w:r>
+        <w:t xml:space="preserve">Comente "SESSÃO" que eu te enviarei todos os detalhes no seu direct para agendarmos sua sessão estratégica gratuita, ou acessa direto pelo link da bio.</w:t>
       </w:r>
     </w:p>
     <w:p>

</xml_diff>